<commit_message>
Basically ok, should review, consider adding EPub3
</commit_message>
<xml_diff>
--- a/QuickIntroAccessibleMaths.docx
+++ b/QuickIntroAccessibleMaths.docx
@@ -1044,14 +1044,6 @@
     </w:p>
     <w:p>
       <w:pPr>
-        <w:pStyle w:val="FirstParagraph"/>
-      </w:pPr>
-      <w:r>
-        <w:t xml:space="preserve">EHC: CAN CAR CONVERT MATHTYPE BACK TO NORMAL WORD?</w:t>
-      </w:r>
-    </w:p>
-    <w:p>
-      <w:pPr>
         <w:pStyle w:val="Compact"/>
         <w:numPr>
           <w:ilvl w:val="0"/>
@@ -1083,9 +1075,45 @@
           <w:rPr>
             <w:rStyle w:val="Hyperlink"/>
           </w:rPr>
-          <w:t xml:space="preserve">Transform Word to other formats</w:t>
+          <w:t xml:space="preserve">Central Access Reader</w:t>
         </w:r>
       </w:hyperlink>
+    </w:p>
+    <w:p>
+      <w:pPr>
+        <w:pStyle w:val="Compact"/>
+        <w:numPr>
+          <w:ilvl w:val="1"/>
+          <w:numId w:val="1015"/>
+        </w:numPr>
+      </w:pPr>
+      <w:r>
+        <w:t xml:space="preserve">Transforms to specially set up HTML for screenreaders</w:t>
+      </w:r>
+    </w:p>
+    <w:p>
+      <w:pPr>
+        <w:pStyle w:val="Compact"/>
+        <w:numPr>
+          <w:ilvl w:val="1"/>
+          <w:numId w:val="1015"/>
+        </w:numPr>
+      </w:pPr>
+      <w:r>
+        <w:t xml:space="preserve">Can output MP3</w:t>
+      </w:r>
+    </w:p>
+    <w:p>
+      <w:pPr>
+        <w:pStyle w:val="Compact"/>
+        <w:numPr>
+          <w:ilvl w:val="1"/>
+          <w:numId w:val="1015"/>
+        </w:numPr>
+      </w:pPr>
+      <w:r>
+        <w:t xml:space="preserve">Can be used as text to speech software (but is not screenreader compatible)</w:t>
+      </w:r>
     </w:p>
     <w:p>
       <w:pPr>
@@ -1106,10 +1134,34 @@
     </w:p>
     <w:p>
       <w:pPr>
+        <w:pStyle w:val="Compact"/>
+        <w:numPr>
+          <w:ilvl w:val="1"/>
+          <w:numId w:val="1016"/>
+        </w:numPr>
+      </w:pPr>
+      <w:r>
+        <w:t xml:space="preserve">Student can convert to MathType - supply standard format</w:t>
+      </w:r>
+    </w:p>
+    <w:p>
+      <w:pPr>
+        <w:pStyle w:val="Compact"/>
+        <w:numPr>
+          <w:ilvl w:val="1"/>
+          <w:numId w:val="1016"/>
+        </w:numPr>
+      </w:pPr>
+      <w:r>
+        <w:t xml:space="preserve">Conversion back to Word is not possible in bulk</w:t>
+      </w:r>
+    </w:p>
+    <w:p>
+      <w:pPr>
         <w:pStyle w:val="FirstParagraph"/>
       </w:pPr>
       <w:r>
-        <w:t xml:space="preserve">At the time of writing transforming from (any) PowerPoint is trickier. Best not to use this as a source format.</w:t>
+        <w:t xml:space="preserve">At the time of writing transforming from (any) PowerPoint is tricky. Best not to use this as a source format. If making slides, I would use Quarto (this!).</w:t>
       </w:r>
     </w:p>
     <w:bookmarkEnd w:id="54"/>
@@ -1126,7 +1178,7 @@
       <w:pPr>
         <w:numPr>
           <w:ilvl w:val="0"/>
-          <w:numId w:val="1015"/>
+          <w:numId w:val="1017"/>
         </w:numPr>
       </w:pPr>
       <w:r>
@@ -1145,7 +1197,7 @@
       <w:pPr>
         <w:numPr>
           <w:ilvl w:val="0"/>
-          <w:numId w:val="1015"/>
+          <w:numId w:val="1017"/>
         </w:numPr>
       </w:pPr>
       <w:r>
@@ -1243,7 +1295,7 @@
         <w:pStyle w:val="Compact"/>
         <w:numPr>
           <w:ilvl w:val="1"/>
-          <w:numId w:val="1016"/>
+          <w:numId w:val="1018"/>
         </w:numPr>
       </w:pPr>
       <w:r>
@@ -1255,7 +1307,7 @@
         <w:pStyle w:val="Compact"/>
         <w:numPr>
           <w:ilvl w:val="1"/>
-          <w:numId w:val="1016"/>
+          <w:numId w:val="1018"/>
         </w:numPr>
       </w:pPr>
       <w:r>
@@ -1267,7 +1319,7 @@
         <w:pStyle w:val="Compact"/>
         <w:numPr>
           <w:ilvl w:val="1"/>
-          <w:numId w:val="1016"/>
+          <w:numId w:val="1018"/>
         </w:numPr>
       </w:pPr>
       <w:r>
@@ -1279,7 +1331,7 @@
         <w:pStyle w:val="Compact"/>
         <w:numPr>
           <w:ilvl w:val="1"/>
-          <w:numId w:val="1016"/>
+          <w:numId w:val="1018"/>
         </w:numPr>
       </w:pPr>
       <w:r>
@@ -1309,7 +1361,7 @@
         <w:pStyle w:val="Compact"/>
         <w:numPr>
           <w:ilvl w:val="0"/>
-          <w:numId w:val="1017"/>
+          <w:numId w:val="1019"/>
         </w:numPr>
       </w:pPr>
       <w:r>
@@ -1349,7 +1401,7 @@
         <w:pStyle w:val="Compact"/>
         <w:numPr>
           <w:ilvl w:val="1"/>
-          <w:numId w:val="1018"/>
+          <w:numId w:val="1020"/>
         </w:numPr>
       </w:pPr>
       <w:r>
@@ -1361,7 +1413,7 @@
         <w:pStyle w:val="Compact"/>
         <w:numPr>
           <w:ilvl w:val="1"/>
-          <w:numId w:val="1018"/>
+          <w:numId w:val="1020"/>
         </w:numPr>
       </w:pPr>
       <w:r>
@@ -1386,7 +1438,7 @@
         <w:pStyle w:val="Compact"/>
         <w:numPr>
           <w:ilvl w:val="1"/>
-          <w:numId w:val="1018"/>
+          <w:numId w:val="1020"/>
         </w:numPr>
       </w:pPr>
       <w:r>
@@ -1398,7 +1450,7 @@
         <w:pStyle w:val="Compact"/>
         <w:numPr>
           <w:ilvl w:val="1"/>
-          <w:numId w:val="1018"/>
+          <w:numId w:val="1020"/>
         </w:numPr>
       </w:pPr>
       <w:r>
@@ -1420,7 +1472,7 @@
         <w:pStyle w:val="Compact"/>
         <w:numPr>
           <w:ilvl w:val="0"/>
-          <w:numId w:val="1017"/>
+          <w:numId w:val="1019"/>
         </w:numPr>
       </w:pPr>
       <w:r>
@@ -1432,7 +1484,7 @@
         <w:pStyle w:val="Compact"/>
         <w:numPr>
           <w:ilvl w:val="1"/>
-          <w:numId w:val="1019"/>
+          <w:numId w:val="1021"/>
         </w:numPr>
       </w:pPr>
       <w:hyperlink r:id="rId59">
@@ -1455,7 +1507,7 @@
         <w:pStyle w:val="Compact"/>
         <w:numPr>
           <w:ilvl w:val="2"/>
-          <w:numId w:val="1020"/>
+          <w:numId w:val="1022"/>
         </w:numPr>
       </w:pPr>
       <w:hyperlink r:id="rId60">
@@ -1478,7 +1530,7 @@
         <w:pStyle w:val="Compact"/>
         <w:numPr>
           <w:ilvl w:val="1"/>
-          <w:numId w:val="1019"/>
+          <w:numId w:val="1021"/>
         </w:numPr>
       </w:pPr>
       <w:hyperlink r:id="rId61">
@@ -1501,7 +1553,7 @@
         <w:pStyle w:val="Compact"/>
         <w:numPr>
           <w:ilvl w:val="1"/>
-          <w:numId w:val="1019"/>
+          <w:numId w:val="1021"/>
         </w:numPr>
       </w:pPr>
       <w:hyperlink r:id="rId62">
@@ -1531,7 +1583,7 @@
         <w:pStyle w:val="Compact"/>
         <w:numPr>
           <w:ilvl w:val="0"/>
-          <w:numId w:val="1021"/>
+          <w:numId w:val="1023"/>
         </w:numPr>
       </w:pPr>
       <w:r>
@@ -1543,7 +1595,7 @@
         <w:pStyle w:val="Compact"/>
         <w:numPr>
           <w:ilvl w:val="1"/>
-          <w:numId w:val="1022"/>
+          <w:numId w:val="1024"/>
         </w:numPr>
       </w:pPr>
       <w:hyperlink r:id="rId64">
@@ -1560,7 +1612,7 @@
         <w:pStyle w:val="Compact"/>
         <w:numPr>
           <w:ilvl w:val="1"/>
-          <w:numId w:val="1022"/>
+          <w:numId w:val="1024"/>
         </w:numPr>
       </w:pPr>
       <w:hyperlink r:id="rId65">
@@ -1577,7 +1629,7 @@
         <w:pStyle w:val="Compact"/>
         <w:numPr>
           <w:ilvl w:val="1"/>
-          <w:numId w:val="1022"/>
+          <w:numId w:val="1024"/>
         </w:numPr>
       </w:pPr>
       <w:hyperlink r:id="rId66">
@@ -1620,7 +1672,7 @@
         <w:pStyle w:val="Compact"/>
         <w:numPr>
           <w:ilvl w:val="1"/>
-          <w:numId w:val="1022"/>
+          <w:numId w:val="1024"/>
         </w:numPr>
       </w:pPr>
       <w:hyperlink r:id="rId67">
@@ -1654,7 +1706,7 @@
         <w:pStyle w:val="Compact"/>
         <w:numPr>
           <w:ilvl w:val="1"/>
-          <w:numId w:val="1022"/>
+          <w:numId w:val="1024"/>
         </w:numPr>
       </w:pPr>
       <w:hyperlink r:id="rId69">
@@ -1677,7 +1729,7 @@
         <w:pStyle w:val="Compact"/>
         <w:numPr>
           <w:ilvl w:val="2"/>
-          <w:numId w:val="1023"/>
+          <w:numId w:val="1025"/>
         </w:numPr>
       </w:pPr>
       <w:r>
@@ -1689,7 +1741,7 @@
         <w:pStyle w:val="Compact"/>
         <w:numPr>
           <w:ilvl w:val="2"/>
-          <w:numId w:val="1023"/>
+          <w:numId w:val="1025"/>
         </w:numPr>
       </w:pPr>
       <w:r>
@@ -1701,7 +1753,7 @@
         <w:pStyle w:val="Compact"/>
         <w:numPr>
           <w:ilvl w:val="2"/>
-          <w:numId w:val="1023"/>
+          <w:numId w:val="1025"/>
         </w:numPr>
       </w:pPr>
       <w:r>
@@ -1713,7 +1765,7 @@
         <w:pStyle w:val="Compact"/>
         <w:numPr>
           <w:ilvl w:val="2"/>
-          <w:numId w:val="1023"/>
+          <w:numId w:val="1025"/>
         </w:numPr>
       </w:pPr>
       <w:hyperlink r:id="rId70">
@@ -1730,7 +1782,7 @@
         <w:pStyle w:val="Compact"/>
         <w:numPr>
           <w:ilvl w:val="0"/>
-          <w:numId w:val="1021"/>
+          <w:numId w:val="1023"/>
         </w:numPr>
       </w:pPr>
       <w:r>
@@ -1742,7 +1794,7 @@
         <w:pStyle w:val="Compact"/>
         <w:numPr>
           <w:ilvl w:val="1"/>
-          <w:numId w:val="1024"/>
+          <w:numId w:val="1026"/>
         </w:numPr>
       </w:pPr>
       <w:hyperlink r:id="rId71">
@@ -1759,7 +1811,7 @@
         <w:pStyle w:val="Compact"/>
         <w:numPr>
           <w:ilvl w:val="1"/>
-          <w:numId w:val="1024"/>
+          <w:numId w:val="1026"/>
         </w:numPr>
       </w:pPr>
       <w:hyperlink r:id="rId72">
@@ -1795,7 +1847,7 @@
         <w:pStyle w:val="Compact"/>
         <w:numPr>
           <w:ilvl w:val="0"/>
-          <w:numId w:val="1025"/>
+          <w:numId w:val="1027"/>
         </w:numPr>
       </w:pPr>
       <w:r>
@@ -1807,7 +1859,7 @@
         <w:pStyle w:val="Compact"/>
         <w:numPr>
           <w:ilvl w:val="0"/>
-          <w:numId w:val="1025"/>
+          <w:numId w:val="1027"/>
         </w:numPr>
       </w:pPr>
       <w:r>
@@ -1819,7 +1871,7 @@
         <w:pStyle w:val="Compact"/>
         <w:numPr>
           <w:ilvl w:val="1"/>
-          <w:numId w:val="1026"/>
+          <w:numId w:val="1028"/>
         </w:numPr>
       </w:pPr>
       <w:r>
@@ -1831,7 +1883,7 @@
         <w:pStyle w:val="Compact"/>
         <w:numPr>
           <w:ilvl w:val="1"/>
-          <w:numId w:val="1026"/>
+          <w:numId w:val="1028"/>
         </w:numPr>
       </w:pPr>
       <w:r>
@@ -1857,7 +1909,7 @@
         <w:pStyle w:val="Compact"/>
         <w:numPr>
           <w:ilvl w:val="2"/>
-          <w:numId w:val="1027"/>
+          <w:numId w:val="1029"/>
         </w:numPr>
       </w:pPr>
       <w:r>
@@ -1869,7 +1921,7 @@
         <w:pStyle w:val="Compact"/>
         <w:numPr>
           <w:ilvl w:val="2"/>
-          <w:numId w:val="1027"/>
+          <w:numId w:val="1029"/>
         </w:numPr>
       </w:pPr>
       <w:r>
@@ -1891,9 +1943,41 @@
           <w:rPr>
             <w:rStyle w:val="Hyperlink"/>
           </w:rPr>
-          <w:t xml:space="preserve">Github repository</w:t>
+          <w:t xml:space="preserve">Github repository source - see qmd file</w:t>
         </w:r>
       </w:hyperlink>
+    </w:p>
+    <w:p>
+      <w:pPr>
+        <w:pStyle w:val="BodyText"/>
+      </w:pPr>
+      <w:r>
+        <w:t xml:space="preserve">Here is some text which is only included in the notes formats!</w:t>
+      </w:r>
+    </w:p>
+    <w:p>
+      <w:pPr>
+        <w:pStyle w:val="Compact"/>
+        <w:numPr>
+          <w:ilvl w:val="0"/>
+          <w:numId w:val="1030"/>
+        </w:numPr>
+      </w:pPr>
+      <w:r>
+        <w:t xml:space="preserve">To prove it is possible to create slides and notes from one source</w:t>
+      </w:r>
+    </w:p>
+    <w:p>
+      <w:pPr>
+        <w:pStyle w:val="Compact"/>
+        <w:numPr>
+          <w:ilvl w:val="0"/>
+          <w:numId w:val="1030"/>
+        </w:numPr>
+      </w:pPr>
+      <w:r>
+        <w:t xml:space="preserve">You will find this part only in the html document and the Word format, not in any of the slide formats</w:t>
+      </w:r>
     </w:p>
     <w:bookmarkEnd w:id="77"/>
     <w:sectPr>
@@ -2330,6 +2414,15 @@
     <w:abstractNumId w:val="991"/>
   </w:num>
   <w:num w:numId="1027">
+    <w:abstractNumId w:val="991"/>
+  </w:num>
+  <w:num w:numId="1028">
+    <w:abstractNumId w:val="991"/>
+  </w:num>
+  <w:num w:numId="1029">
+    <w:abstractNumId w:val="991"/>
+  </w:num>
+  <w:num w:numId="1030">
     <w:abstractNumId w:val="991"/>
   </w:num>
 </w:numbering>

</xml_diff>

<commit_message>
Bit of reviewing, added BookML
</commit_message>
<xml_diff>
--- a/QuickIntroAccessibleMaths.docx
+++ b/QuickIntroAccessibleMaths.docx
@@ -767,7 +767,7 @@
         <w:pStyle w:val="BodyText"/>
       </w:pPr>
       <w:r>
-        <w:t xml:space="preserve">Not all reader assistive technology can access maths all formats!</w:t>
+        <w:t xml:space="preserve">Not all reader assistive technology can access maths in all formats!</w:t>
       </w:r>
     </w:p>
     <w:p>
@@ -898,7 +898,7 @@
     </w:p>
     <w:bookmarkEnd w:id="46"/>
     <w:bookmarkEnd w:id="47"/>
-    <w:bookmarkStart w:id="74" w:name="how-do-you-get-started"/>
+    <w:bookmarkStart w:id="75" w:name="how-do-you-get-started"/>
     <w:p>
       <w:pPr>
         <w:pStyle w:val="Heading1"/>
@@ -961,10 +961,40 @@
         <w:t xml:space="preserve"> </w:t>
       </w:r>
       <w:r>
-        <w:t xml:space="preserve">mathematical text written using the MS 365 equation editor. E.g. if you are writing about the variable (x) or (</w:t>
-      </w:r>
-      <w:r>
-        <w:t xml:space="preserve">) it should be written as an equation. If you are writing (x^2) it should be written as an equation.</w:t>
+        <w:t xml:space="preserve">mathematical text written using the MS 365 equation editor. E.g. if you are writing about the variable (</w:t>
+      </w:r>
+      <m:oMath>
+        <m:r>
+          <m:t>x</m:t>
+        </m:r>
+      </m:oMath>
+      <w:r>
+        <w:t xml:space="preserve">) or (</w:t>
+      </w:r>
+      <m:oMath>
+        <m:r>
+          <m:t>θ</m:t>
+        </m:r>
+      </m:oMath>
+      <w:r>
+        <w:t xml:space="preserve">) it should be written as an equation. If you are writing (</w:t>
+      </w:r>
+      <m:oMath>
+        <m:sSup>
+          <m:e>
+            <m:r>
+              <m:t>x</m:t>
+            </m:r>
+          </m:e>
+          <m:sup>
+            <m:r>
+              <m:t>2</m:t>
+            </m:r>
+          </m:sup>
+        </m:sSup>
+      </m:oMath>
+      <w:r>
+        <w:t xml:space="preserve">) it should be written as an equation.</w:t>
       </w:r>
     </w:p>
     <w:p>
@@ -1347,7 +1377,7 @@
       </w:r>
     </w:p>
     <w:bookmarkEnd w:id="56"/>
-    <w:bookmarkStart w:id="63" w:name="scientific-document-preparation-systems"/>
+    <w:bookmarkStart w:id="64" w:name="scientific-document-preparation-systems"/>
     <w:p>
       <w:pPr>
         <w:pStyle w:val="Heading2"/>
@@ -1379,6 +1409,20 @@
         </w:r>
       </w:hyperlink>
       <w:r>
+        <w:t xml:space="preserve">,</w:t>
+      </w:r>
+      <w:r>
+        <w:t xml:space="preserve"> </w:t>
+      </w:r>
+      <w:hyperlink r:id="rId58">
+        <w:r>
+          <w:rPr>
+            <w:rStyle w:val="Hyperlink"/>
+          </w:rPr>
+          <w:t xml:space="preserve">BookML</w:t>
+        </w:r>
+      </w:hyperlink>
+      <w:r>
         <w:t xml:space="preserve"> </w:t>
       </w:r>
       <w:r>
@@ -1387,7 +1431,7 @@
       <w:r>
         <w:t xml:space="preserve"> </w:t>
       </w:r>
-      <w:hyperlink r:id="rId58">
+      <w:hyperlink r:id="rId59">
         <w:r>
           <w:rPr>
             <w:rStyle w:val="Hyperlink"/>
@@ -1487,7 +1531,7 @@
           <w:numId w:val="1021"/>
         </w:numPr>
       </w:pPr>
-      <w:hyperlink r:id="rId59">
+      <w:hyperlink r:id="rId60">
         <w:r>
           <w:rPr>
             <w:rStyle w:val="Hyperlink"/>
@@ -1510,7 +1554,7 @@
           <w:numId w:val="1022"/>
         </w:numPr>
       </w:pPr>
-      <w:hyperlink r:id="rId60">
+      <w:hyperlink r:id="rId61">
         <w:r>
           <w:rPr>
             <w:rStyle w:val="Hyperlink"/>
@@ -1533,7 +1577,7 @@
           <w:numId w:val="1021"/>
         </w:numPr>
       </w:pPr>
-      <w:hyperlink r:id="rId61">
+      <w:hyperlink r:id="rId62">
         <w:r>
           <w:rPr>
             <w:rStyle w:val="Hyperlink"/>
@@ -1556,7 +1600,7 @@
           <w:numId w:val="1021"/>
         </w:numPr>
       </w:pPr>
-      <w:hyperlink r:id="rId62">
+      <w:hyperlink r:id="rId63">
         <w:r>
           <w:rPr>
             <w:rStyle w:val="Hyperlink"/>
@@ -1565,11 +1609,11 @@
         </w:r>
       </w:hyperlink>
       <w:r>
-        <w:t xml:space="preserve">, built on top of RMarkdown and Bookdown; should only be used if the other formats can’t meet needs</w:t>
-      </w:r>
-    </w:p>
-    <w:bookmarkEnd w:id="63"/>
-    <w:bookmarkStart w:id="73" w:name="non-text-elements"/>
+        <w:t xml:space="preserve">, built using RMarkdown and Bookdown; only if other methods can’t meet needs</w:t>
+      </w:r>
+    </w:p>
+    <w:bookmarkEnd w:id="64"/>
+    <w:bookmarkStart w:id="74" w:name="non-text-elements"/>
     <w:p>
       <w:pPr>
         <w:pStyle w:val="Heading2"/>
@@ -1598,7 +1642,7 @@
           <w:numId w:val="1024"/>
         </w:numPr>
       </w:pPr>
-      <w:hyperlink r:id="rId64">
+      <w:hyperlink r:id="rId65">
         <w:r>
           <w:rPr>
             <w:rStyle w:val="Hyperlink"/>
@@ -1615,7 +1659,7 @@
           <w:numId w:val="1024"/>
         </w:numPr>
       </w:pPr>
-      <w:hyperlink r:id="rId65">
+      <w:hyperlink r:id="rId66">
         <w:r>
           <w:rPr>
             <w:rStyle w:val="Hyperlink"/>
@@ -1632,7 +1676,7 @@
           <w:numId w:val="1024"/>
         </w:numPr>
       </w:pPr>
-      <w:hyperlink r:id="rId66">
+      <w:hyperlink r:id="rId67">
         <w:r>
           <w:rPr>
             <w:rStyle w:val="Hyperlink"/>
@@ -1675,7 +1719,7 @@
           <w:numId w:val="1024"/>
         </w:numPr>
       </w:pPr>
-      <w:hyperlink r:id="rId67">
+      <w:hyperlink r:id="rId68">
         <w:r>
           <w:rPr>
             <w:rStyle w:val="Hyperlink"/>
@@ -1692,7 +1736,7 @@
       <w:r>
         <w:t xml:space="preserve"> </w:t>
       </w:r>
-      <w:hyperlink r:id="rId68">
+      <w:hyperlink r:id="rId69">
         <w:r>
           <w:rPr>
             <w:rStyle w:val="Hyperlink"/>
@@ -1709,7 +1753,7 @@
           <w:numId w:val="1024"/>
         </w:numPr>
       </w:pPr>
-      <w:hyperlink r:id="rId69">
+      <w:hyperlink r:id="rId70">
         <w:r>
           <w:rPr>
             <w:rStyle w:val="Hyperlink"/>
@@ -1768,7 +1812,7 @@
           <w:numId w:val="1025"/>
         </w:numPr>
       </w:pPr>
-      <w:hyperlink r:id="rId70">
+      <w:hyperlink r:id="rId71">
         <w:r>
           <w:rPr>
             <w:rStyle w:val="Hyperlink"/>
@@ -1797,7 +1841,7 @@
           <w:numId w:val="1026"/>
         </w:numPr>
       </w:pPr>
-      <w:hyperlink r:id="rId71">
+      <w:hyperlink r:id="rId72">
         <w:r>
           <w:rPr>
             <w:rStyle w:val="Hyperlink"/>
@@ -1814,7 +1858,7 @@
           <w:numId w:val="1026"/>
         </w:numPr>
       </w:pPr>
-      <w:hyperlink r:id="rId72">
+      <w:hyperlink r:id="rId73">
         <w:r>
           <w:rPr>
             <w:rStyle w:val="Hyperlink"/>
@@ -1823,9 +1867,9 @@
         </w:r>
       </w:hyperlink>
     </w:p>
-    <w:bookmarkEnd w:id="73"/>
     <w:bookmarkEnd w:id="74"/>
-    <w:bookmarkStart w:id="77" w:name="next-steps"/>
+    <w:bookmarkEnd w:id="75"/>
+    <w:bookmarkStart w:id="78" w:name="next-steps"/>
     <w:p>
       <w:pPr>
         <w:pStyle w:val="Heading1"/>
@@ -1892,7 +1936,7 @@
       <w:r>
         <w:t xml:space="preserve"> </w:t>
       </w:r>
-      <w:hyperlink r:id="rId75">
+      <w:hyperlink r:id="rId76">
         <w:r>
           <w:rPr>
             <w:rStyle w:val="Hyperlink"/>
@@ -1938,7 +1982,7 @@
       <w:r>
         <w:t xml:space="preserve"> </w:t>
       </w:r>
-      <w:hyperlink r:id="rId76">
+      <w:hyperlink r:id="rId77">
         <w:r>
           <w:rPr>
             <w:rStyle w:val="Hyperlink"/>
@@ -1979,7 +2023,7 @@
         <w:t xml:space="preserve">You will find this part only in the html document and the Word format, not in any of the slide formats</w:t>
       </w:r>
     </w:p>
-    <w:bookmarkEnd w:id="77"/>
+    <w:bookmarkEnd w:id="78"/>
     <w:sectPr>
       <w:footnotePr>
         <w:numRestart w:val="eachSect"/>

</xml_diff>

<commit_message>
Tidied up, slight re-ordering of pdf information, added formats
</commit_message>
<xml_diff>
--- a/QuickIntroAccessibleMaths.docx
+++ b/QuickIntroAccessibleMaths.docx
@@ -445,7 +445,7 @@
     </w:p>
     <w:bookmarkEnd w:id="30"/>
     <w:bookmarkEnd w:id="31"/>
-    <w:bookmarkStart w:id="41" w:name="what-is-the-maths-specific-problem"/>
+    <w:bookmarkStart w:id="44" w:name="what-is-the-maths-specific-problem"/>
     <w:p>
       <w:pPr>
         <w:pStyle w:val="Heading1"/>
@@ -524,7 +524,7 @@
       </w:hyperlink>
     </w:p>
     <w:bookmarkEnd w:id="36"/>
-    <w:bookmarkStart w:id="40" w:name="could-we-solve-it-by"/>
+    <w:bookmarkStart w:id="43" w:name="could-we-solve-it-by"/>
     <w:p>
       <w:pPr>
         <w:pStyle w:val="Heading2"/>
@@ -538,30 +538,39 @@
         <w:pStyle w:val="FirstParagraph"/>
       </w:pPr>
       <w:r>
-        <w:t xml:space="preserve">Can we not solve this by ensuring that the PDF is accessible? Unfortunately, the answer is no. The act of creating the PDF destroys the structure of mathematical, and similar, expressions. Reflow on a small screen produces…</w:t>
-      </w:r>
-    </w:p>
-    <w:p>
-      <w:pPr>
-        <w:pStyle w:val="BodyText"/>
+        <w:t xml:space="preserve">Can we not solve this by ensuring that the PDF is accessible? Unfortunately, the answer is currently, not yet</w:t>
+      </w:r>
+      <w:r>
+        <w:rPr>
+          <w:rStyle w:val="FootnoteReference"/>
+        </w:rPr>
+        <w:footnoteReference w:id="37"/>
+      </w:r>
+      <w:r>
+        <w:t xml:space="preserve">. In current software and typically in-use PDF standards, the act of creating the PDF destroys the structure of mathematical, and similar, expressions. Reflow on a small screen produces…</w:t>
+      </w:r>
+    </w:p>
+    <w:p>
+      <w:pPr>
+        <w:pStyle w:val="CaptionedFigure"/>
       </w:pPr>
       <w:r>
         <w:drawing>
           <wp:inline>
             <wp:extent cx="2133600" cy="1126564"/>
             <wp:effectExtent b="0" l="0" r="0" t="0"/>
-            <wp:docPr descr="" title="" id="38" name="Picture"/>
+            <wp:docPr descr="Quadratic equation destroyed by reflow" title="" id="41" name="Picture"/>
             <a:graphic>
               <a:graphicData uri="http://schemas.openxmlformats.org/drawingml/2006/picture">
                 <pic:pic>
                   <pic:nvPicPr>
-                    <pic:cNvPr descr="./Figs/reflowing.png" id="39" name="Picture"/>
+                    <pic:cNvPr descr="./Figs/reflowing.png" id="42" name="Picture"/>
                     <pic:cNvPicPr>
                       <a:picLocks noChangeArrowheads="1" noChangeAspect="1"/>
                     </pic:cNvPicPr>
                   </pic:nvPicPr>
                   <pic:blipFill>
-                    <a:blip r:embed="rId37"/>
+                    <a:blip r:embed="rId40"/>
                     <a:stretch>
                       <a:fillRect/>
                     </a:stretch>
@@ -588,9 +597,17 @@
         </w:drawing>
       </w:r>
     </w:p>
-    <w:bookmarkEnd w:id="40"/>
-    <w:bookmarkEnd w:id="41"/>
-    <w:bookmarkStart w:id="47" w:name="what-do-solutions-look-like"/>
+    <w:p>
+      <w:pPr>
+        <w:pStyle w:val="ImageCaption"/>
+      </w:pPr>
+      <w:r>
+        <w:t xml:space="preserve">Quadratic equation destroyed by reflow</w:t>
+      </w:r>
+    </w:p>
+    <w:bookmarkEnd w:id="43"/>
+    <w:bookmarkEnd w:id="44"/>
+    <w:bookmarkStart w:id="49" w:name="what-do-solutions-look-like"/>
     <w:p>
       <w:pPr>
         <w:pStyle w:val="Heading1"/>
@@ -599,7 +616,7 @@
         <w:t xml:space="preserve">What do solutions look like?</w:t>
       </w:r>
     </w:p>
-    <w:bookmarkStart w:id="42" w:name="structure-software"/>
+    <w:bookmarkStart w:id="45" w:name="structure-software"/>
     <w:p>
       <w:pPr>
         <w:pStyle w:val="Heading2"/>
@@ -645,7 +662,7 @@
         <w:pStyle w:val="FirstParagraph"/>
       </w:pPr>
       <w:r>
-        <w:t xml:space="preserve">Only four formats of mathematical text are technically accessible:</w:t>
+        <w:t xml:space="preserve">Until all this work is finished for PDF, only four formats of mathematical text are technically accessible:</w:t>
       </w:r>
     </w:p>
     <w:p>
@@ -744,8 +761,8 @@
         <w:t xml:space="preserve">in this format.</w:t>
       </w:r>
     </w:p>
-    <w:bookmarkEnd w:id="42"/>
-    <w:bookmarkStart w:id="46" w:name="so-job-done"/>
+    <w:bookmarkEnd w:id="45"/>
+    <w:bookmarkStart w:id="48" w:name="so-job-done"/>
     <w:p>
       <w:pPr>
         <w:pStyle w:val="Heading2"/>
@@ -791,7 +808,7 @@
         </w:numPr>
       </w:pPr>
       <w:r>
-        <w:t xml:space="preserve">Some cannot not be transformed easily to others</w:t>
+        <w:t xml:space="preserve">Some formats cannot not be transformed easily to others</w:t>
       </w:r>
     </w:p>
     <w:p>
@@ -807,16 +824,7 @@
         <w:pStyle w:val="BodyText"/>
       </w:pPr>
       <w:r>
-        <w:t xml:space="preserve">For authors using the LaTeX scientific document preparation system none of the above formats are native outputs</w:t>
-      </w:r>
-      <w:r>
-        <w:rPr>
-          <w:rStyle w:val="FootnoteReference"/>
-        </w:rPr>
-        <w:footnoteReference w:id="43"/>
-      </w:r>
-      <w:r>
-        <w:t xml:space="preserve">.</w:t>
+        <w:t xml:space="preserve">For authors using the LaTeX scientific document preparation system none of the above formats are native outputs.</w:t>
       </w:r>
       <w:r>
         <w:t xml:space="preserve"> </w:t>
@@ -878,7 +886,7 @@
         <w:rPr>
           <w:rStyle w:val="FootnoteReference"/>
         </w:rPr>
-        <w:footnoteReference w:id="44"/>
+        <w:footnoteReference w:id="46"/>
       </w:r>
       <w:r>
         <w:t xml:space="preserve"> </w:t>
@@ -890,15 +898,15 @@
         <w:rPr>
           <w:rStyle w:val="FootnoteReference"/>
         </w:rPr>
-        <w:footnoteReference w:id="45"/>
+        <w:footnoteReference w:id="47"/>
       </w:r>
       <w:r>
         <w:t xml:space="preserve">.</w:t>
       </w:r>
     </w:p>
-    <w:bookmarkEnd w:id="46"/>
-    <w:bookmarkEnd w:id="47"/>
-    <w:bookmarkStart w:id="75" w:name="how-do-you-get-started"/>
+    <w:bookmarkEnd w:id="48"/>
+    <w:bookmarkEnd w:id="49"/>
+    <w:bookmarkStart w:id="79" w:name="how-do-you-get-started"/>
     <w:p>
       <w:pPr>
         <w:pStyle w:val="Heading1"/>
@@ -907,7 +915,7 @@
         <w:t xml:space="preserve">How do you get started?</w:t>
       </w:r>
     </w:p>
-    <w:bookmarkStart w:id="50" w:name="wordpowerpoint-365"/>
+    <w:bookmarkStart w:id="52" w:name="wordpowerpoint-365"/>
     <w:p>
       <w:pPr>
         <w:pStyle w:val="Heading2"/>
@@ -927,7 +935,7 @@
       <w:r>
         <w:t xml:space="preserve">Use the inbuilt Accessibility Checker and information on e.g. </w:t>
       </w:r>
-      <w:hyperlink r:id="rId48">
+      <w:hyperlink r:id="rId50">
         <w:r>
           <w:rPr>
             <w:rStyle w:val="Hyperlink"/>
@@ -952,6 +960,8 @@
       </w:r>
       <w:r>
         <w:rPr>
+          <w:b/>
+          <w:bCs/>
           <w:i/>
           <w:iCs/>
         </w:rPr>
@@ -1053,7 +1063,7 @@
           <w:numId w:val="1012"/>
         </w:numPr>
       </w:pPr>
-      <w:hyperlink r:id="rId49">
+      <w:hyperlink r:id="rId51">
         <w:r>
           <w:rPr>
             <w:rStyle w:val="Hyperlink"/>
@@ -1062,8 +1072,8 @@
         </w:r>
       </w:hyperlink>
     </w:p>
-    <w:bookmarkEnd w:id="50"/>
-    <w:bookmarkStart w:id="54" w:name="wordpowerpoint-transforms-and-tools"/>
+    <w:bookmarkEnd w:id="52"/>
+    <w:bookmarkStart w:id="56" w:name="wordpowerpoint-transforms-and-tools"/>
     <w:p>
       <w:pPr>
         <w:pStyle w:val="Heading2"/>
@@ -1080,7 +1090,7 @@
           <w:numId w:val="1014"/>
         </w:numPr>
       </w:pPr>
-      <w:hyperlink r:id="rId51">
+      <w:hyperlink r:id="rId53">
         <w:r>
           <w:rPr>
             <w:rStyle w:val="Hyperlink"/>
@@ -1100,7 +1110,7 @@
           <w:numId w:val="1014"/>
         </w:numPr>
       </w:pPr>
-      <w:hyperlink r:id="rId52">
+      <w:hyperlink r:id="rId54">
         <w:r>
           <w:rPr>
             <w:rStyle w:val="Hyperlink"/>
@@ -1153,7 +1163,7 @@
           <w:numId w:val="1014"/>
         </w:numPr>
       </w:pPr>
-      <w:hyperlink r:id="rId53">
+      <w:hyperlink r:id="rId55">
         <w:r>
           <w:rPr>
             <w:rStyle w:val="Hyperlink"/>
@@ -1191,11 +1201,11 @@
         <w:pStyle w:val="FirstParagraph"/>
       </w:pPr>
       <w:r>
-        <w:t xml:space="preserve">At the time of writing transforming from (any) PowerPoint is tricky. Best not to use this as a source format. If making slides, I would use Quarto (this!).</w:t>
-      </w:r>
-    </w:p>
-    <w:bookmarkEnd w:id="54"/>
-    <w:bookmarkStart w:id="56" w:name="html-wcag-2.2-aa-mathjax"/>
+        <w:t xml:space="preserve">At the time of writing transforming from (any) PowerPoint is tricky. Best not to use this as a source format. If making slides, I would use Quarto (used to make this!).</w:t>
+      </w:r>
+    </w:p>
+    <w:bookmarkEnd w:id="56"/>
+    <w:bookmarkStart w:id="59" w:name="html-wcag-2.2-aa-mathjax"/>
     <w:p>
       <w:pPr>
         <w:pStyle w:val="Heading2"/>
@@ -1214,7 +1224,7 @@
       <w:r>
         <w:t xml:space="preserve">Check it meets the legal requirement of WCAG 2.2 Level AA with e.g. </w:t>
       </w:r>
-      <w:hyperlink r:id="rId55">
+      <w:hyperlink r:id="rId57">
         <w:r>
           <w:rPr>
             <w:rStyle w:val="Hyperlink"/>
@@ -1341,7 +1351,7 @@
         </w:numPr>
       </w:pPr>
       <w:r>
-        <w:t xml:space="preserve">Structural integrity enables assistive technology including text-to-speech, screenreaders, electronic Braille</w:t>
+        <w:t xml:space="preserve">Encoded structure enables assistive technology including text-to-speech, screenreaders, electronic Braille</w:t>
       </w:r>
     </w:p>
     <w:p>
@@ -1373,11 +1383,28 @@
         <w:pStyle w:val="FirstParagraph"/>
       </w:pPr>
       <w:r>
-        <w:t xml:space="preserve">We recommend using MathJax 2.7.9 or MathJax 4.* as MathJax 3.x does not enable reflow on zoom.</w:t>
-      </w:r>
-    </w:p>
-    <w:bookmarkEnd w:id="56"/>
-    <w:bookmarkStart w:id="64" w:name="scientific-document-preparation-systems"/>
+        <w:t xml:space="preserve">We recommend using MathJax 2.7.9 or</w:t>
+      </w:r>
+      <w:r>
+        <w:t xml:space="preserve"> </w:t>
+      </w:r>
+      <w:hyperlink r:id="rId58">
+        <w:r>
+          <w:rPr>
+            <w:rStyle w:val="Hyperlink"/>
+          </w:rPr>
+          <w:t xml:space="preserve">MathJax 4.* as MathJax 3.* does not enable reflow on zoom</w:t>
+        </w:r>
+      </w:hyperlink>
+      <w:r>
+        <w:t xml:space="preserve"> </w:t>
+      </w:r>
+      <w:r>
+        <w:t xml:space="preserve">(a requirement for WCAG 2.2 AA).</w:t>
+      </w:r>
+    </w:p>
+    <w:bookmarkEnd w:id="59"/>
+    <w:bookmarkStart w:id="68" w:name="scientific-document-preparation-systems"/>
     <w:p>
       <w:pPr>
         <w:pStyle w:val="Heading2"/>
@@ -1395,12 +1422,24 @@
         </w:numPr>
       </w:pPr>
       <w:r>
-        <w:t xml:space="preserve">Attempt to transform the LaTeX to HTML with MathJax using</w:t>
-      </w:r>
-      <w:r>
-        <w:t xml:space="preserve"> </w:t>
-      </w:r>
-      <w:hyperlink r:id="rId57">
+        <w:t xml:space="preserve">Attempt to transform the LaTeX</w:t>
+      </w:r>
+      <w:r>
+        <w:rPr>
+          <w:rStyle w:val="FootnoteReference"/>
+        </w:rPr>
+        <w:footnoteReference w:id="60"/>
+      </w:r>
+      <w:r>
+        <w:t xml:space="preserve"> </w:t>
+      </w:r>
+      <w:r>
+        <w:t xml:space="preserve">to HTML with MathJax using</w:t>
+      </w:r>
+      <w:r>
+        <w:t xml:space="preserve"> </w:t>
+      </w:r>
+      <w:hyperlink r:id="rId61">
         <w:r>
           <w:rPr>
             <w:rStyle w:val="Hyperlink"/>
@@ -1414,7 +1453,7 @@
       <w:r>
         <w:t xml:space="preserve"> </w:t>
       </w:r>
-      <w:hyperlink r:id="rId58">
+      <w:hyperlink r:id="rId62">
         <w:r>
           <w:rPr>
             <w:rStyle w:val="Hyperlink"/>
@@ -1431,7 +1470,7 @@
       <w:r>
         <w:t xml:space="preserve"> </w:t>
       </w:r>
-      <w:hyperlink r:id="rId59">
+      <w:hyperlink r:id="rId63">
         <w:r>
           <w:rPr>
             <w:rStyle w:val="Hyperlink"/>
@@ -1502,7 +1541,7 @@
           <w:b/>
           <w:bCs/>
         </w:rPr>
-        <w:t xml:space="preserve">No known Beamer solution</w:t>
+        <w:t xml:space="preserve">I don’t know of a Beamer solution</w:t>
       </w:r>
       <w:r>
         <w:t xml:space="preserve"> </w:t>
@@ -1531,7 +1570,7 @@
           <w:numId w:val="1021"/>
         </w:numPr>
       </w:pPr>
-      <w:hyperlink r:id="rId60">
+      <w:hyperlink r:id="rId64">
         <w:r>
           <w:rPr>
             <w:rStyle w:val="Hyperlink"/>
@@ -1554,7 +1593,7 @@
           <w:numId w:val="1022"/>
         </w:numPr>
       </w:pPr>
-      <w:hyperlink r:id="rId61">
+      <w:hyperlink r:id="rId65">
         <w:r>
           <w:rPr>
             <w:rStyle w:val="Hyperlink"/>
@@ -1577,7 +1616,7 @@
           <w:numId w:val="1021"/>
         </w:numPr>
       </w:pPr>
-      <w:hyperlink r:id="rId62">
+      <w:hyperlink r:id="rId66">
         <w:r>
           <w:rPr>
             <w:rStyle w:val="Hyperlink"/>
@@ -1600,7 +1639,7 @@
           <w:numId w:val="1021"/>
         </w:numPr>
       </w:pPr>
-      <w:hyperlink r:id="rId63">
+      <w:hyperlink r:id="rId67">
         <w:r>
           <w:rPr>
             <w:rStyle w:val="Hyperlink"/>
@@ -1612,8 +1651,8 @@
         <w:t xml:space="preserve">, built using RMarkdown and Bookdown; only if other methods can’t meet needs</w:t>
       </w:r>
     </w:p>
-    <w:bookmarkEnd w:id="64"/>
-    <w:bookmarkStart w:id="74" w:name="non-text-elements"/>
+    <w:bookmarkEnd w:id="68"/>
+    <w:bookmarkStart w:id="78" w:name="non-text-elements"/>
     <w:p>
       <w:pPr>
         <w:pStyle w:val="Heading2"/>
@@ -1642,7 +1681,7 @@
           <w:numId w:val="1024"/>
         </w:numPr>
       </w:pPr>
-      <w:hyperlink r:id="rId65">
+      <w:hyperlink r:id="rId69">
         <w:r>
           <w:rPr>
             <w:rStyle w:val="Hyperlink"/>
@@ -1659,7 +1698,7 @@
           <w:numId w:val="1024"/>
         </w:numPr>
       </w:pPr>
-      <w:hyperlink r:id="rId66">
+      <w:hyperlink r:id="rId70">
         <w:r>
           <w:rPr>
             <w:rStyle w:val="Hyperlink"/>
@@ -1676,7 +1715,7 @@
           <w:numId w:val="1024"/>
         </w:numPr>
       </w:pPr>
-      <w:hyperlink r:id="rId67">
+      <w:hyperlink r:id="rId71">
         <w:r>
           <w:rPr>
             <w:rStyle w:val="Hyperlink"/>
@@ -1719,7 +1758,7 @@
           <w:numId w:val="1024"/>
         </w:numPr>
       </w:pPr>
-      <w:hyperlink r:id="rId68">
+      <w:hyperlink r:id="rId72">
         <w:r>
           <w:rPr>
             <w:rStyle w:val="Hyperlink"/>
@@ -1736,7 +1775,7 @@
       <w:r>
         <w:t xml:space="preserve"> </w:t>
       </w:r>
-      <w:hyperlink r:id="rId69">
+      <w:hyperlink r:id="rId73">
         <w:r>
           <w:rPr>
             <w:rStyle w:val="Hyperlink"/>
@@ -1753,7 +1792,7 @@
           <w:numId w:val="1024"/>
         </w:numPr>
       </w:pPr>
-      <w:hyperlink r:id="rId70">
+      <w:hyperlink r:id="rId74">
         <w:r>
           <w:rPr>
             <w:rStyle w:val="Hyperlink"/>
@@ -1812,7 +1851,7 @@
           <w:numId w:val="1025"/>
         </w:numPr>
       </w:pPr>
-      <w:hyperlink r:id="rId71">
+      <w:hyperlink r:id="rId75">
         <w:r>
           <w:rPr>
             <w:rStyle w:val="Hyperlink"/>
@@ -1841,7 +1880,7 @@
           <w:numId w:val="1026"/>
         </w:numPr>
       </w:pPr>
-      <w:hyperlink r:id="rId72">
+      <w:hyperlink r:id="rId76">
         <w:r>
           <w:rPr>
             <w:rStyle w:val="Hyperlink"/>
@@ -1858,7 +1897,7 @@
           <w:numId w:val="1026"/>
         </w:numPr>
       </w:pPr>
-      <w:hyperlink r:id="rId73">
+      <w:hyperlink r:id="rId77">
         <w:r>
           <w:rPr>
             <w:rStyle w:val="Hyperlink"/>
@@ -1867,9 +1906,9 @@
         </w:r>
       </w:hyperlink>
     </w:p>
-    <w:bookmarkEnd w:id="74"/>
-    <w:bookmarkEnd w:id="75"/>
-    <w:bookmarkStart w:id="78" w:name="next-steps"/>
+    <w:bookmarkEnd w:id="78"/>
+    <w:bookmarkEnd w:id="79"/>
+    <w:bookmarkStart w:id="82" w:name="next-steps"/>
     <w:p>
       <w:pPr>
         <w:pStyle w:val="Heading1"/>
@@ -1936,7 +1975,7 @@
       <w:r>
         <w:t xml:space="preserve"> </w:t>
       </w:r>
-      <w:hyperlink r:id="rId76">
+      <w:hyperlink r:id="rId80">
         <w:r>
           <w:rPr>
             <w:rStyle w:val="Hyperlink"/>
@@ -1982,7 +2021,7 @@
       <w:r>
         <w:t xml:space="preserve"> </w:t>
       </w:r>
-      <w:hyperlink r:id="rId77">
+      <w:hyperlink r:id="rId81">
         <w:r>
           <w:rPr>
             <w:rStyle w:val="Hyperlink"/>
@@ -2023,7 +2062,7 @@
         <w:t xml:space="preserve">You will find this part only in the html document and the Word format, not in any of the slide formats</w:t>
       </w:r>
     </w:p>
-    <w:bookmarkEnd w:id="78"/>
+    <w:bookmarkEnd w:id="82"/>
     <w:sectPr>
       <w:footnotePr>
         <w:numRestart w:val="eachSect"/>
@@ -2091,7 +2130,7 @@
       </w:r>
     </w:p>
   </w:footnote>
-  <w:footnote w:id="43">
+  <w:footnote w:id="37">
     <w:p>
       <w:pPr>
         <w:pStyle w:val="FootnoteText"/>
@@ -2106,7 +2145,38 @@
         <w:t xml:space="preserve"> </w:t>
       </w:r>
       <w:r>
-        <w:t xml:space="preserve">Work is ongoing to create a version of LaTeX, extra encoding within an adapted PDF</w:t>
+        <w:t xml:space="preserve">Work is ongoing to add encoding within a new PDF standard (PDF/UA-2 and WTPDF (Well-Tagged PDF) standards),</w:t>
+      </w:r>
+      <w:r>
+        <w:t xml:space="preserve"> </w:t>
+      </w:r>
+      <w:hyperlink r:id="rId38">
+        <w:r>
+          <w:rPr>
+            <w:rStyle w:val="Hyperlink"/>
+          </w:rPr>
+          <w:t xml:space="preserve">create a version of LaTeX which can do this</w:t>
+        </w:r>
+      </w:hyperlink>
+      <w:r>
+        <w:t xml:space="preserve"> </w:t>
+      </w:r>
+      <w:r>
+        <w:t xml:space="preserve">(itself, a multi-year project</w:t>
+      </w:r>
+      <w:r>
+        <w:t xml:space="preserve"> </w:t>
+      </w:r>
+      <w:hyperlink r:id="rId39">
+        <w:r>
+          <w:rPr>
+            <w:rStyle w:val="Hyperlink"/>
+          </w:rPr>
+          <w:t xml:space="preserve">currently in stage 4 of enabling package authors to apply changes</w:t>
+        </w:r>
+      </w:hyperlink>
+      <w:r>
+        <w:t xml:space="preserve">),</w:t>
       </w:r>
       <w:r>
         <w:t xml:space="preserve"> </w:t>
@@ -2122,7 +2192,64 @@
         <w:t xml:space="preserve"> </w:t>
       </w:r>
       <w:r>
-        <w:t xml:space="preserve">software which works with the extra encoding. In the meantime we need to either convert the LaTeX to other formats or switch to a different scientific document preparation system. It is</w:t>
+        <w:t xml:space="preserve">software which works with the extra encoding. The assistive technology vendors would then also need to support all of this. In the meantime we need to either convert the LaTeX to other formats or switch to a different scientific document preparation system.</w:t>
+      </w:r>
+    </w:p>
+  </w:footnote>
+  <w:footnote w:id="46">
+    <w:p>
+      <w:pPr>
+        <w:pStyle w:val="FootnoteText"/>
+      </w:pPr>
+      <w:r>
+        <w:rPr>
+          <w:rStyle w:val="FootnoteReference"/>
+        </w:rPr>
+        <w:footnoteRef/>
+      </w:r>
+      <w:r>
+        <w:t xml:space="preserve"> </w:t>
+      </w:r>
+      <w:r>
+        <w:t xml:space="preserve">Adhering as closely as possible to RNIB clear print guidelines</w:t>
+      </w:r>
+    </w:p>
+  </w:footnote>
+  <w:footnote w:id="47">
+    <w:p>
+      <w:pPr>
+        <w:pStyle w:val="FootnoteText"/>
+      </w:pPr>
+      <w:r>
+        <w:rPr>
+          <w:rStyle w:val="FootnoteReference"/>
+        </w:rPr>
+        <w:footnoteRef/>
+      </w:r>
+      <w:r>
+        <w:t xml:space="preserve"> </w:t>
+      </w:r>
+      <w:r>
+        <w:t xml:space="preserve">Last year we had to assist an author to create a printable PDF for a disabled student after the author had made a whole (and completely technically accessible) course using ProTeXt - but couldn’t get PDF working and the HTML produced poor print output…</w:t>
+      </w:r>
+    </w:p>
+  </w:footnote>
+  <w:footnote w:id="60">
+    <w:p>
+      <w:pPr>
+        <w:pStyle w:val="FootnoteText"/>
+      </w:pPr>
+      <w:r>
+        <w:rPr>
+          <w:rStyle w:val="FootnoteReference"/>
+        </w:rPr>
+        <w:footnoteRef/>
+      </w:r>
+      <w:r>
+        <w:t xml:space="preserve"> </w:t>
+      </w:r>
+      <w:r>
+        <w:t xml:space="preserve">It is</w:t>
       </w:r>
       <w:r>
         <w:t xml:space="preserve"> </w:t>
@@ -2151,44 +2278,6 @@
       </w:r>
       <w:r>
         <w:t xml:space="preserve">of the convertible subset without realising or knowing why, the addition of a package, change of preamble order, use of a seemingly innocent command…</w:t>
-      </w:r>
-    </w:p>
-  </w:footnote>
-  <w:footnote w:id="44">
-    <w:p>
-      <w:pPr>
-        <w:pStyle w:val="FootnoteText"/>
-      </w:pPr>
-      <w:r>
-        <w:rPr>
-          <w:rStyle w:val="FootnoteReference"/>
-        </w:rPr>
-        <w:footnoteRef/>
-      </w:r>
-      <w:r>
-        <w:t xml:space="preserve"> </w:t>
-      </w:r>
-      <w:r>
-        <w:t xml:space="preserve">Adhering as closely as possible to RNIB clear print guidelines</w:t>
-      </w:r>
-    </w:p>
-  </w:footnote>
-  <w:footnote w:id="45">
-    <w:p>
-      <w:pPr>
-        <w:pStyle w:val="FootnoteText"/>
-      </w:pPr>
-      <w:r>
-        <w:rPr>
-          <w:rStyle w:val="FootnoteReference"/>
-        </w:rPr>
-        <w:footnoteRef/>
-      </w:r>
-      <w:r>
-        <w:t xml:space="preserve"> </w:t>
-      </w:r>
-      <w:r>
-        <w:t xml:space="preserve">Last year we had to assist an author to create a printable PDF for a disabled student after the author had made a whole (and completely technically accessible) course using ProTeXt - but couldn’t get PDF working and the HTML produced poor print output…</w:t>
       </w:r>
     </w:p>
   </w:footnote>

</xml_diff>

<commit_message>
Adding in AM's image guidelines
</commit_message>
<xml_diff>
--- a/QuickIntroAccessibleMaths.docx
+++ b/QuickIntroAccessibleMaths.docx
@@ -906,7 +906,7 @@
     </w:p>
     <w:bookmarkEnd w:id="48"/>
     <w:bookmarkEnd w:id="49"/>
-    <w:bookmarkStart w:id="79" w:name="how-do-you-get-started"/>
+    <w:bookmarkStart w:id="80" w:name="how-do-you-get-started"/>
     <w:p>
       <w:pPr>
         <w:pStyle w:val="Heading1"/>
@@ -1652,7 +1652,7 @@
       </w:r>
     </w:p>
     <w:bookmarkEnd w:id="68"/>
-    <w:bookmarkStart w:id="78" w:name="non-text-elements"/>
+    <w:bookmarkStart w:id="79" w:name="non-text-elements"/>
     <w:p>
       <w:pPr>
         <w:pStyle w:val="Heading2"/>
@@ -1797,6 +1797,23 @@
           <w:rPr>
             <w:rStyle w:val="Hyperlink"/>
           </w:rPr>
+          <w:t xml:space="preserve">Complex images - making sense for accessibility</w:t>
+        </w:r>
+      </w:hyperlink>
+    </w:p>
+    <w:p>
+      <w:pPr>
+        <w:pStyle w:val="Compact"/>
+        <w:numPr>
+          <w:ilvl w:val="1"/>
+          <w:numId w:val="1024"/>
+        </w:numPr>
+      </w:pPr>
+      <w:hyperlink r:id="rId75">
+        <w:r>
+          <w:rPr>
+            <w:rStyle w:val="Hyperlink"/>
+          </w:rPr>
           <w:t xml:space="preserve">DIAGRAM Center</w:t>
         </w:r>
       </w:hyperlink>
@@ -1816,7 +1833,7 @@
         </w:numPr>
       </w:pPr>
       <w:r>
-        <w:t xml:space="preserve">Poet Image Description Training Tool</w:t>
+        <w:t xml:space="preserve">Poet Image Description Training Tool, Image description guidelines and Sample book</w:t>
       </w:r>
     </w:p>
     <w:p>
@@ -1827,31 +1844,7 @@
           <w:numId w:val="1025"/>
         </w:numPr>
       </w:pPr>
-      <w:r>
-        <w:t xml:space="preserve">Image description guidelines</w:t>
-      </w:r>
-    </w:p>
-    <w:p>
-      <w:pPr>
-        <w:pStyle w:val="Compact"/>
-        <w:numPr>
-          <w:ilvl w:val="2"/>
-          <w:numId w:val="1025"/>
-        </w:numPr>
-      </w:pPr>
-      <w:r>
-        <w:t xml:space="preserve">Sample book</w:t>
-      </w:r>
-    </w:p>
-    <w:p>
-      <w:pPr>
-        <w:pStyle w:val="Compact"/>
-        <w:numPr>
-          <w:ilvl w:val="2"/>
-          <w:numId w:val="1025"/>
-        </w:numPr>
-      </w:pPr>
-      <w:hyperlink r:id="rId75">
+      <w:hyperlink r:id="rId76">
         <w:r>
           <w:rPr>
             <w:rStyle w:val="Hyperlink"/>
@@ -1880,7 +1873,7 @@
           <w:numId w:val="1026"/>
         </w:numPr>
       </w:pPr>
-      <w:hyperlink r:id="rId76">
+      <w:hyperlink r:id="rId77">
         <w:r>
           <w:rPr>
             <w:rStyle w:val="Hyperlink"/>
@@ -1897,7 +1890,7 @@
           <w:numId w:val="1026"/>
         </w:numPr>
       </w:pPr>
-      <w:hyperlink r:id="rId77">
+      <w:hyperlink r:id="rId78">
         <w:r>
           <w:rPr>
             <w:rStyle w:val="Hyperlink"/>
@@ -1906,9 +1899,9 @@
         </w:r>
       </w:hyperlink>
     </w:p>
-    <w:bookmarkEnd w:id="78"/>
     <w:bookmarkEnd w:id="79"/>
-    <w:bookmarkStart w:id="82" w:name="next-steps"/>
+    <w:bookmarkEnd w:id="80"/>
+    <w:bookmarkStart w:id="83" w:name="next-steps"/>
     <w:p>
       <w:pPr>
         <w:pStyle w:val="Heading1"/>
@@ -1975,7 +1968,7 @@
       <w:r>
         <w:t xml:space="preserve"> </w:t>
       </w:r>
-      <w:hyperlink r:id="rId80">
+      <w:hyperlink r:id="rId81">
         <w:r>
           <w:rPr>
             <w:rStyle w:val="Hyperlink"/>
@@ -2021,7 +2014,7 @@
       <w:r>
         <w:t xml:space="preserve"> </w:t>
       </w:r>
-      <w:hyperlink r:id="rId81">
+      <w:hyperlink r:id="rId82">
         <w:r>
           <w:rPr>
             <w:rStyle w:val="Hyperlink"/>
@@ -2062,7 +2055,7 @@
         <w:t xml:space="preserve">You will find this part only in the html document and the Word format, not in any of the slide formats</w:t>
       </w:r>
     </w:p>
-    <w:bookmarkEnd w:id="82"/>
+    <w:bookmarkEnd w:id="83"/>
     <w:sectPr>
       <w:footnotePr>
         <w:numRestart w:val="eachSect"/>

</xml_diff>